<commit_message>
Task 4 and AI_USAGE.md
</commit_message>
<xml_diff>
--- a/CSCE465_HW1_Report.docx
+++ b/CSCE465_HW1_Report.docx
@@ -1485,9 +1485,739 @@
           <w:rFonts w:ascii="Times New Roman" w:hAnsi="Times New Roman" w:cs="Times New Roman"/>
         </w:rPr>
       </w:pPr>
+      <w:r>
+        <w:rPr>
+          <w:rFonts w:ascii="Times New Roman" w:hAnsi="Times New Roman" w:cs="Times New Roman"/>
+        </w:rPr>
+        <w:t xml:space="preserve">I am using the exec-policy from </w:t>
+      </w:r>
+      <w:proofErr w:type="spellStart"/>
+      <w:r>
+        <w:rPr>
+          <w:rFonts w:ascii="Times New Roman" w:hAnsi="Times New Roman" w:cs="Times New Roman"/>
+        </w:rPr>
+        <w:t>openclaw</w:t>
+      </w:r>
+      <w:proofErr w:type="spellEnd"/>
+      <w:r>
+        <w:rPr>
+          <w:rFonts w:ascii="Times New Roman" w:hAnsi="Times New Roman" w:cs="Times New Roman"/>
+        </w:rPr>
+        <w:t xml:space="preserve"> to develop my threat model.</w:t>
+      </w:r>
+    </w:p>
+    <w:p>
+      <w:pPr>
+        <w:rPr>
+          <w:rFonts w:ascii="Times New Roman" w:hAnsi="Times New Roman" w:cs="Times New Roman"/>
+        </w:rPr>
+      </w:pPr>
+      <w:r>
+        <w:rPr>
+          <w:noProof/>
+        </w:rPr>
+        <w:drawing>
+          <wp:inline distT="0" distB="0" distL="0" distR="0" wp14:anchorId="091E865E" wp14:editId="44BA0B10">
+            <wp:extent cx="5943600" cy="3518535"/>
+            <wp:effectExtent l="0" t="0" r="0" b="5715"/>
+            <wp:docPr id="1292005152" name="Picture 1"/>
+            <wp:cNvGraphicFramePr>
+              <a:graphicFrameLocks xmlns:a="http://schemas.openxmlformats.org/drawingml/2006/main" noChangeAspect="1"/>
+            </wp:cNvGraphicFramePr>
+            <a:graphic xmlns:a="http://schemas.openxmlformats.org/drawingml/2006/main">
+              <a:graphicData uri="http://schemas.openxmlformats.org/drawingml/2006/picture">
+                <pic:pic xmlns:pic="http://schemas.openxmlformats.org/drawingml/2006/picture">
+                  <pic:nvPicPr>
+                    <pic:cNvPr id="0" name="Picture 1"/>
+                    <pic:cNvPicPr>
+                      <a:picLocks noChangeAspect="1" noChangeArrowheads="1"/>
+                    </pic:cNvPicPr>
+                  </pic:nvPicPr>
+                  <pic:blipFill>
+                    <a:blip r:embed="rId12" cstate="print">
+                      <a:extLst>
+                        <a:ext uri="{28A0092B-C50C-407E-A947-70E740481C1C}">
+                          <a14:useLocalDpi xmlns:a14="http://schemas.microsoft.com/office/drawing/2010/main" val="0"/>
+                        </a:ext>
+                      </a:extLst>
+                    </a:blip>
+                    <a:srcRect/>
+                    <a:stretch>
+                      <a:fillRect/>
+                    </a:stretch>
+                  </pic:blipFill>
+                  <pic:spPr bwMode="auto">
+                    <a:xfrm>
+                      <a:off x="0" y="0"/>
+                      <a:ext cx="5943600" cy="3518535"/>
+                    </a:xfrm>
+                    <a:prstGeom prst="rect">
+                      <a:avLst/>
+                    </a:prstGeom>
+                    <a:noFill/>
+                    <a:ln>
+                      <a:noFill/>
+                    </a:ln>
+                  </pic:spPr>
+                </pic:pic>
+              </a:graphicData>
+            </a:graphic>
+          </wp:inline>
+        </w:drawing>
+      </w:r>
+    </w:p>
+    <w:p>
+      <w:pPr>
+        <w:rPr>
+          <w:rFonts w:ascii="Times New Roman" w:hAnsi="Times New Roman" w:cs="Times New Roman"/>
+        </w:rPr>
+      </w:pPr>
+      <w:r>
+        <w:rPr>
+          <w:noProof/>
+        </w:rPr>
+        <w:drawing>
+          <wp:anchor distT="0" distB="0" distL="114300" distR="114300" simplePos="0" relativeHeight="251660288" behindDoc="1" locked="0" layoutInCell="1" allowOverlap="1" wp14:anchorId="3BA93A4B" wp14:editId="73533773">
+            <wp:simplePos x="0" y="0"/>
+            <wp:positionH relativeFrom="column">
+              <wp:posOffset>156210</wp:posOffset>
+            </wp:positionH>
+            <wp:positionV relativeFrom="page">
+              <wp:posOffset>5776412</wp:posOffset>
+            </wp:positionV>
+            <wp:extent cx="5554980" cy="3344545"/>
+            <wp:effectExtent l="0" t="0" r="7620" b="8255"/>
+            <wp:wrapTight wrapText="bothSides">
+              <wp:wrapPolygon edited="0">
+                <wp:start x="0" y="0"/>
+                <wp:lineTo x="0" y="21530"/>
+                <wp:lineTo x="21556" y="21530"/>
+                <wp:lineTo x="21556" y="0"/>
+                <wp:lineTo x="0" y="0"/>
+              </wp:wrapPolygon>
+            </wp:wrapTight>
+            <wp:docPr id="1092285316" name="Picture 2"/>
+            <wp:cNvGraphicFramePr>
+              <a:graphicFrameLocks xmlns:a="http://schemas.openxmlformats.org/drawingml/2006/main" noChangeAspect="1"/>
+            </wp:cNvGraphicFramePr>
+            <a:graphic xmlns:a="http://schemas.openxmlformats.org/drawingml/2006/main">
+              <a:graphicData uri="http://schemas.openxmlformats.org/drawingml/2006/picture">
+                <pic:pic xmlns:pic="http://schemas.openxmlformats.org/drawingml/2006/picture">
+                  <pic:nvPicPr>
+                    <pic:cNvPr id="0" name="Picture 3"/>
+                    <pic:cNvPicPr>
+                      <a:picLocks noChangeAspect="1" noChangeArrowheads="1"/>
+                    </pic:cNvPicPr>
+                  </pic:nvPicPr>
+                  <pic:blipFill>
+                    <a:blip r:embed="rId13" cstate="print">
+                      <a:extLst>
+                        <a:ext uri="{28A0092B-C50C-407E-A947-70E740481C1C}">
+                          <a14:useLocalDpi xmlns:a14="http://schemas.microsoft.com/office/drawing/2010/main" val="0"/>
+                        </a:ext>
+                      </a:extLst>
+                    </a:blip>
+                    <a:srcRect/>
+                    <a:stretch>
+                      <a:fillRect/>
+                    </a:stretch>
+                  </pic:blipFill>
+                  <pic:spPr bwMode="auto">
+                    <a:xfrm>
+                      <a:off x="0" y="0"/>
+                      <a:ext cx="5554980" cy="3344545"/>
+                    </a:xfrm>
+                    <a:prstGeom prst="rect">
+                      <a:avLst/>
+                    </a:prstGeom>
+                    <a:noFill/>
+                    <a:ln>
+                      <a:noFill/>
+                    </a:ln>
+                  </pic:spPr>
+                </pic:pic>
+              </a:graphicData>
+            </a:graphic>
+            <wp14:sizeRelH relativeFrom="margin">
+              <wp14:pctWidth>0</wp14:pctWidth>
+            </wp14:sizeRelH>
+            <wp14:sizeRelV relativeFrom="margin">
+              <wp14:pctHeight>0</wp14:pctHeight>
+            </wp14:sizeRelV>
+          </wp:anchor>
+        </w:drawing>
+      </w:r>
+      <w:r>
+        <w:rPr>
+          <w:rFonts w:ascii="Times New Roman" w:hAnsi="Times New Roman" w:cs="Times New Roman"/>
+        </w:rPr>
+        <w:t>As we can see in the last box, for tools “ask=off” means that the model will not ask permission to run tools.</w:t>
+      </w:r>
+      <w:r>
+        <w:rPr>
+          <w:rFonts w:ascii="Times New Roman" w:hAnsi="Times New Roman" w:cs="Times New Roman"/>
+        </w:rPr>
+        <w:t xml:space="preserve"> Below is the threat model, which can also be found in attack-surface-map.jpg</w:t>
+      </w:r>
+    </w:p>
+    <w:p>
+      <w:pPr>
+        <w:rPr>
+          <w:rFonts w:ascii="Times New Roman" w:hAnsi="Times New Roman" w:cs="Times New Roman"/>
+        </w:rPr>
+      </w:pPr>
+      <w:r>
+        <w:rPr>
+          <w:rFonts w:ascii="Times New Roman" w:hAnsi="Times New Roman" w:cs="Times New Roman"/>
+          <w:b/>
+          <w:bCs/>
+        </w:rPr>
+        <w:lastRenderedPageBreak/>
+        <w:t>Security Advisory</w:t>
+      </w:r>
+    </w:p>
+    <w:p>
+      <w:pPr>
+        <w:rPr>
+          <w:rFonts w:ascii="Times New Roman" w:hAnsi="Times New Roman" w:cs="Times New Roman"/>
+        </w:rPr>
+      </w:pPr>
+      <w:r>
+        <w:rPr>
+          <w:rFonts w:ascii="Times New Roman" w:hAnsi="Times New Roman" w:cs="Times New Roman"/>
+        </w:rPr>
+        <w:t xml:space="preserve">The current </w:t>
+      </w:r>
+      <w:proofErr w:type="spellStart"/>
+      <w:r>
+        <w:rPr>
+          <w:rFonts w:ascii="Times New Roman" w:hAnsi="Times New Roman" w:cs="Times New Roman"/>
+        </w:rPr>
+        <w:t>Openclaw</w:t>
+      </w:r>
+      <w:proofErr w:type="spellEnd"/>
+      <w:r>
+        <w:rPr>
+          <w:rFonts w:ascii="Times New Roman" w:hAnsi="Times New Roman" w:cs="Times New Roman"/>
+        </w:rPr>
+        <w:t xml:space="preserve"> security advisory that I analyzed is GHSA-wwx7-573h-pqwc. This was a vulnerability that </w:t>
+      </w:r>
+      <w:r>
+        <w:rPr>
+          <w:rFonts w:ascii="Times New Roman" w:hAnsi="Times New Roman" w:cs="Times New Roman"/>
+        </w:rPr>
+        <w:t>allowed</w:t>
+      </w:r>
+      <w:r>
+        <w:rPr>
+          <w:rFonts w:ascii="Times New Roman" w:hAnsi="Times New Roman" w:cs="Times New Roman"/>
+        </w:rPr>
+        <w:t xml:space="preserve"> non-owners to access MCP configurations. The problem itself stemmed from </w:t>
+      </w:r>
+      <w:proofErr w:type="spellStart"/>
+      <w:r>
+        <w:rPr>
+          <w:rFonts w:ascii="Times New Roman" w:hAnsi="Times New Roman" w:cs="Times New Roman"/>
+        </w:rPr>
+        <w:t>Openclaw</w:t>
+      </w:r>
+      <w:proofErr w:type="spellEnd"/>
+      <w:r>
+        <w:rPr>
+          <w:rFonts w:ascii="Times New Roman" w:hAnsi="Times New Roman" w:cs="Times New Roman"/>
+        </w:rPr>
+        <w:t xml:space="preserve"> recognizing that the user was authorized to interact with the AI model</w:t>
+      </w:r>
+      <w:r>
+        <w:rPr>
+          <w:rFonts w:ascii="Times New Roman" w:hAnsi="Times New Roman" w:cs="Times New Roman"/>
+        </w:rPr>
+        <w:t>. T</w:t>
+      </w:r>
+      <w:r>
+        <w:rPr>
+          <w:rFonts w:ascii="Times New Roman" w:hAnsi="Times New Roman" w:cs="Times New Roman"/>
+        </w:rPr>
+        <w:t>he</w:t>
+      </w:r>
+      <w:r>
+        <w:rPr>
+          <w:rFonts w:ascii="Times New Roman" w:hAnsi="Times New Roman" w:cs="Times New Roman"/>
+        </w:rPr>
+        <w:t xml:space="preserve"> authorized</w:t>
+      </w:r>
+      <w:r>
+        <w:rPr>
+          <w:rFonts w:ascii="Times New Roman" w:hAnsi="Times New Roman" w:cs="Times New Roman"/>
+        </w:rPr>
+        <w:t xml:space="preserve"> user </w:t>
+      </w:r>
+      <w:r>
+        <w:rPr>
+          <w:rFonts w:ascii="Times New Roman" w:hAnsi="Times New Roman" w:cs="Times New Roman"/>
+        </w:rPr>
+        <w:t>should not have had the authority</w:t>
+      </w:r>
+      <w:r>
+        <w:rPr>
+          <w:rFonts w:ascii="Times New Roman" w:hAnsi="Times New Roman" w:cs="Times New Roman"/>
+        </w:rPr>
+        <w:t xml:space="preserve"> to run the commands “/</w:t>
+      </w:r>
+      <w:proofErr w:type="spellStart"/>
+      <w:r>
+        <w:rPr>
+          <w:rFonts w:ascii="Times New Roman" w:hAnsi="Times New Roman" w:cs="Times New Roman"/>
+        </w:rPr>
+        <w:t>mcp</w:t>
+      </w:r>
+      <w:proofErr w:type="spellEnd"/>
+      <w:r>
+        <w:rPr>
+          <w:rFonts w:ascii="Times New Roman" w:hAnsi="Times New Roman" w:cs="Times New Roman"/>
+        </w:rPr>
+        <w:t xml:space="preserve"> set” and “/</w:t>
+      </w:r>
+      <w:proofErr w:type="spellStart"/>
+      <w:r>
+        <w:rPr>
+          <w:rFonts w:ascii="Times New Roman" w:hAnsi="Times New Roman" w:cs="Times New Roman"/>
+        </w:rPr>
+        <w:t>mcp</w:t>
+      </w:r>
+      <w:proofErr w:type="spellEnd"/>
+      <w:r>
+        <w:rPr>
+          <w:rFonts w:ascii="Times New Roman" w:hAnsi="Times New Roman" w:cs="Times New Roman"/>
+        </w:rPr>
+        <w:t xml:space="preserve"> unset”</w:t>
+      </w:r>
+      <w:r>
+        <w:rPr>
+          <w:rFonts w:ascii="Times New Roman" w:hAnsi="Times New Roman" w:cs="Times New Roman"/>
+        </w:rPr>
+        <w:t xml:space="preserve"> however, they were. </w:t>
+      </w:r>
+    </w:p>
+    <w:p>
+      <w:pPr>
+        <w:rPr>
+          <w:rFonts w:ascii="Times New Roman" w:hAnsi="Times New Roman" w:cs="Times New Roman"/>
+        </w:rPr>
+      </w:pPr>
+      <w:r>
+        <w:rPr>
+          <w:rFonts w:ascii="Times New Roman" w:hAnsi="Times New Roman" w:cs="Times New Roman"/>
+        </w:rPr>
+        <w:t xml:space="preserve">This was a high security advisory with a severity of CVSS 8.8. It compromised the integrity of the MCP configuration in allowing non-owners to adjust the configuration. The availability was compromised because the MCP could then be available to those it was not supposed to be available to or made unavailable to those that should have it. And finally, the confidentiality was compromised by providing access to data available through </w:t>
+      </w:r>
+      <w:proofErr w:type="spellStart"/>
+      <w:r>
+        <w:rPr>
+          <w:rFonts w:ascii="Times New Roman" w:hAnsi="Times New Roman" w:cs="Times New Roman"/>
+        </w:rPr>
+        <w:t>Openclaw</w:t>
+      </w:r>
+      <w:proofErr w:type="spellEnd"/>
+      <w:r>
+        <w:rPr>
+          <w:rFonts w:ascii="Times New Roman" w:hAnsi="Times New Roman" w:cs="Times New Roman"/>
+        </w:rPr>
+        <w:t xml:space="preserve">. The root cause of this critical vulnerability is the lack of proper authorization. </w:t>
+      </w:r>
+      <w:proofErr w:type="spellStart"/>
+      <w:r>
+        <w:rPr>
+          <w:rFonts w:ascii="Times New Roman" w:hAnsi="Times New Roman" w:cs="Times New Roman"/>
+        </w:rPr>
+        <w:t>Openclaw</w:t>
+      </w:r>
+      <w:proofErr w:type="spellEnd"/>
+      <w:r>
+        <w:rPr>
+          <w:rFonts w:ascii="Times New Roman" w:hAnsi="Times New Roman" w:cs="Times New Roman"/>
+        </w:rPr>
+        <w:t xml:space="preserve"> does the first check to see if the user can access the </w:t>
+      </w:r>
+      <w:r>
+        <w:rPr>
+          <w:rFonts w:ascii="Times New Roman" w:hAnsi="Times New Roman" w:cs="Times New Roman"/>
+        </w:rPr>
+        <w:t>model but</w:t>
+      </w:r>
+      <w:r>
+        <w:rPr>
+          <w:rFonts w:ascii="Times New Roman" w:hAnsi="Times New Roman" w:cs="Times New Roman"/>
+        </w:rPr>
+        <w:t xml:space="preserve"> does not do another check when the user attempts to access the MCP configurations. That is an action that should require owner level permissions </w:t>
+      </w:r>
+      <w:r>
+        <w:rPr>
+          <w:rFonts w:ascii="Times New Roman" w:hAnsi="Times New Roman" w:cs="Times New Roman"/>
+        </w:rPr>
+        <w:t xml:space="preserve">but instead anyone with access to the model could change the MCP settings. There is very little </w:t>
+      </w:r>
+      <w:r>
+        <w:rPr>
+          <w:rFonts w:ascii="Times New Roman" w:hAnsi="Times New Roman" w:cs="Times New Roman"/>
+        </w:rPr>
+        <w:t>an</w:t>
+      </w:r>
+      <w:r>
+        <w:rPr>
+          <w:rFonts w:ascii="Times New Roman" w:hAnsi="Times New Roman" w:cs="Times New Roman"/>
+        </w:rPr>
+        <w:t xml:space="preserve"> attack</w:t>
+      </w:r>
+      <w:r>
+        <w:rPr>
+          <w:rFonts w:ascii="Times New Roman" w:hAnsi="Times New Roman" w:cs="Times New Roman"/>
+        </w:rPr>
+        <w:t>er</w:t>
+      </w:r>
+      <w:r>
+        <w:rPr>
+          <w:rFonts w:ascii="Times New Roman" w:hAnsi="Times New Roman" w:cs="Times New Roman"/>
+        </w:rPr>
+        <w:t xml:space="preserve"> </w:t>
+      </w:r>
+      <w:proofErr w:type="gramStart"/>
+      <w:r>
+        <w:rPr>
+          <w:rFonts w:ascii="Times New Roman" w:hAnsi="Times New Roman" w:cs="Times New Roman"/>
+        </w:rPr>
+        <w:t>actually has</w:t>
+      </w:r>
+      <w:proofErr w:type="gramEnd"/>
+      <w:r>
+        <w:rPr>
+          <w:rFonts w:ascii="Times New Roman" w:hAnsi="Times New Roman" w:cs="Times New Roman"/>
+        </w:rPr>
+        <w:t xml:space="preserve"> to do in this instance</w:t>
+      </w:r>
+      <w:r>
+        <w:rPr>
+          <w:rFonts w:ascii="Times New Roman" w:hAnsi="Times New Roman" w:cs="Times New Roman"/>
+        </w:rPr>
+        <w:t xml:space="preserve"> to achieve the exploit</w:t>
+      </w:r>
+      <w:r>
+        <w:rPr>
+          <w:rFonts w:ascii="Times New Roman" w:hAnsi="Times New Roman" w:cs="Times New Roman"/>
+        </w:rPr>
+        <w:t xml:space="preserve"> other than just have access to the model.</w:t>
+      </w:r>
+    </w:p>
+    <w:p>
+      <w:pPr>
+        <w:rPr>
+          <w:rFonts w:ascii="Times New Roman" w:hAnsi="Times New Roman" w:cs="Times New Roman"/>
+        </w:rPr>
+      </w:pPr>
+      <w:r>
+        <w:rPr>
+          <w:rFonts w:ascii="Times New Roman" w:hAnsi="Times New Roman" w:cs="Times New Roman"/>
+        </w:rPr>
+        <w:t>This is a vulnerability that can severely cripple a system</w:t>
+      </w:r>
+      <w:r>
+        <w:rPr>
+          <w:rFonts w:ascii="Times New Roman" w:hAnsi="Times New Roman" w:cs="Times New Roman"/>
+        </w:rPr>
+        <w:t xml:space="preserve"> simply</w:t>
+      </w:r>
+      <w:r>
+        <w:rPr>
+          <w:rFonts w:ascii="Times New Roman" w:hAnsi="Times New Roman" w:cs="Times New Roman"/>
+        </w:rPr>
+        <w:t xml:space="preserve"> </w:t>
+      </w:r>
+      <w:r>
+        <w:rPr>
+          <w:rFonts w:ascii="Times New Roman" w:hAnsi="Times New Roman" w:cs="Times New Roman"/>
+        </w:rPr>
+        <w:t xml:space="preserve">by bypassing an important security check. Because of that no matter how much security and encryption you put into your system, this exploit would still be possible. The request comes from an authorized channel therefore any additional security would not catch </w:t>
+      </w:r>
+      <w:proofErr w:type="gramStart"/>
+      <w:r>
+        <w:rPr>
+          <w:rFonts w:ascii="Times New Roman" w:hAnsi="Times New Roman" w:cs="Times New Roman"/>
+        </w:rPr>
+        <w:t>it</w:t>
+      </w:r>
+      <w:proofErr w:type="gramEnd"/>
+      <w:r>
+        <w:rPr>
+          <w:rFonts w:ascii="Times New Roman" w:hAnsi="Times New Roman" w:cs="Times New Roman"/>
+        </w:rPr>
+        <w:t xml:space="preserve"> and the MCP configuration could be disastrously changed. </w:t>
+      </w:r>
+      <w:r>
+        <w:rPr>
+          <w:rFonts w:ascii="Times New Roman" w:hAnsi="Times New Roman" w:cs="Times New Roman"/>
+        </w:rPr>
+        <w:t xml:space="preserve">The impact ranges from a persistent MCP gateway to denial of service and shutdown of the MCP gateway. The persistent gateway would also largely go undetected unless the MCP configuration is examined, meaning the owner might never discover that there was a compromise. </w:t>
+      </w:r>
+    </w:p>
+    <w:p>
+      <w:pPr>
+        <w:rPr>
+          <w:rFonts w:ascii="Times New Roman" w:hAnsi="Times New Roman" w:cs="Times New Roman"/>
+        </w:rPr>
+      </w:pPr>
+      <w:r>
+        <w:rPr>
+          <w:rFonts w:ascii="Times New Roman" w:hAnsi="Times New Roman" w:cs="Times New Roman"/>
+        </w:rPr>
+        <w:t xml:space="preserve">A fix was rolled out for </w:t>
+      </w:r>
+      <w:proofErr w:type="gramStart"/>
+      <w:r>
+        <w:rPr>
+          <w:rFonts w:ascii="Times New Roman" w:hAnsi="Times New Roman" w:cs="Times New Roman"/>
+        </w:rPr>
+        <w:t>the vulnerability</w:t>
+      </w:r>
+      <w:proofErr w:type="gramEnd"/>
+      <w:r>
+        <w:rPr>
+          <w:rFonts w:ascii="Times New Roman" w:hAnsi="Times New Roman" w:cs="Times New Roman"/>
+        </w:rPr>
+        <w:t xml:space="preserve"> in the most recent version, but any </w:t>
+      </w:r>
+      <w:proofErr w:type="spellStart"/>
+      <w:r>
+        <w:rPr>
+          <w:rFonts w:ascii="Times New Roman" w:hAnsi="Times New Roman" w:cs="Times New Roman"/>
+        </w:rPr>
+        <w:t>Openclaw</w:t>
+      </w:r>
+      <w:proofErr w:type="spellEnd"/>
+      <w:r>
+        <w:rPr>
+          <w:rFonts w:ascii="Times New Roman" w:hAnsi="Times New Roman" w:cs="Times New Roman"/>
+        </w:rPr>
+        <w:t xml:space="preserve"> systems that are older than version 2026.7.1 still contain this problem.</w:t>
+      </w:r>
+      <w:r>
+        <w:rPr>
+          <w:rFonts w:ascii="Times New Roman" w:hAnsi="Times New Roman" w:cs="Times New Roman"/>
+        </w:rPr>
+        <w:t xml:space="preserve"> </w:t>
+      </w:r>
+      <w:proofErr w:type="spellStart"/>
+      <w:r>
+        <w:rPr>
+          <w:rFonts w:ascii="Times New Roman" w:hAnsi="Times New Roman" w:cs="Times New Roman"/>
+        </w:rPr>
+        <w:t>Openclaw</w:t>
+      </w:r>
+      <w:proofErr w:type="spellEnd"/>
+      <w:r>
+        <w:rPr>
+          <w:rFonts w:ascii="Times New Roman" w:hAnsi="Times New Roman" w:cs="Times New Roman"/>
+        </w:rPr>
+        <w:t xml:space="preserve"> also suggested disabling MCP chat commands on external channels until the system can be updated. It was also recommended to check the current MCP configurations for any unaccounted-for entries</w:t>
+      </w:r>
+      <w:r>
+        <w:rPr>
+          <w:rFonts w:ascii="Times New Roman" w:hAnsi="Times New Roman" w:cs="Times New Roman"/>
+        </w:rPr>
+        <w:t xml:space="preserve"> in case the vulnerability was exploited on the system before it was widely known and prevention was established</w:t>
+      </w:r>
+      <w:r>
+        <w:rPr>
+          <w:rFonts w:ascii="Times New Roman" w:hAnsi="Times New Roman" w:cs="Times New Roman"/>
+        </w:rPr>
+        <w:t xml:space="preserve">. </w:t>
+      </w:r>
+      <w:r>
+        <w:rPr>
+          <w:rFonts w:ascii="Times New Roman" w:hAnsi="Times New Roman" w:cs="Times New Roman"/>
+        </w:rPr>
+        <w:t>GHSA-wwx7-573h-pqwc</w:t>
+      </w:r>
+      <w:r>
+        <w:rPr>
+          <w:rFonts w:ascii="Times New Roman" w:hAnsi="Times New Roman" w:cs="Times New Roman"/>
+        </w:rPr>
+        <w:t xml:space="preserve"> also led to </w:t>
+      </w:r>
+      <w:proofErr w:type="spellStart"/>
+      <w:r>
+        <w:rPr>
+          <w:rFonts w:ascii="Times New Roman" w:hAnsi="Times New Roman" w:cs="Times New Roman"/>
+        </w:rPr>
+        <w:t>Openclaw</w:t>
+      </w:r>
+      <w:proofErr w:type="spellEnd"/>
+      <w:r>
+        <w:rPr>
+          <w:rFonts w:ascii="Times New Roman" w:hAnsi="Times New Roman" w:cs="Times New Roman"/>
+        </w:rPr>
+        <w:t xml:space="preserve"> adding additional security to permissions and authorization checks in their 2026.7.1 patch. </w:t>
+      </w:r>
+    </w:p>
+    <w:p>
+      <w:pPr>
+        <w:rPr>
+          <w:rFonts w:ascii="Times New Roman" w:hAnsi="Times New Roman" w:cs="Times New Roman"/>
+        </w:rPr>
+      </w:pPr>
+      <w:r>
+        <w:rPr>
+          <w:rFonts w:ascii="Times New Roman" w:hAnsi="Times New Roman" w:cs="Times New Roman"/>
+        </w:rPr>
+        <w:t xml:space="preserve">Prompt injection itself does not enable </w:t>
+      </w:r>
+      <w:proofErr w:type="gramStart"/>
+      <w:r>
+        <w:rPr>
+          <w:rFonts w:ascii="Times New Roman" w:hAnsi="Times New Roman" w:cs="Times New Roman"/>
+        </w:rPr>
+        <w:t>the vulnerability</w:t>
+      </w:r>
+      <w:proofErr w:type="gramEnd"/>
+      <w:r>
+        <w:rPr>
+          <w:rFonts w:ascii="Times New Roman" w:hAnsi="Times New Roman" w:cs="Times New Roman"/>
+        </w:rPr>
+        <w:t xml:space="preserve">, </w:t>
+      </w:r>
+      <w:r>
+        <w:rPr>
+          <w:rFonts w:ascii="Times New Roman" w:hAnsi="Times New Roman" w:cs="Times New Roman"/>
+        </w:rPr>
+        <w:t>GHSA-wwx7-573h-pqwc</w:t>
+      </w:r>
+      <w:r>
+        <w:rPr>
+          <w:rFonts w:ascii="Times New Roman" w:hAnsi="Times New Roman" w:cs="Times New Roman"/>
+        </w:rPr>
+        <w:t>, because the root of the compromise was failure to check authorization</w:t>
+      </w:r>
+      <w:r>
+        <w:rPr>
+          <w:rFonts w:ascii="Times New Roman" w:hAnsi="Times New Roman" w:cs="Times New Roman"/>
+        </w:rPr>
+        <w:t xml:space="preserve">. However, the vulnerability can be exploited using prompt injection. Outside untrusted data can make its way into the user prompt, for instance from a webpage, and execute the code to modify MCP configurations. This is an excellent example of leveraging a known attack to exploit a known vulnerability. Prompt </w:t>
+      </w:r>
+      <w:proofErr w:type="gramStart"/>
+      <w:r>
+        <w:rPr>
+          <w:rFonts w:ascii="Times New Roman" w:hAnsi="Times New Roman" w:cs="Times New Roman"/>
+        </w:rPr>
+        <w:t>injection is</w:t>
+      </w:r>
+      <w:proofErr w:type="gramEnd"/>
+      <w:r>
+        <w:rPr>
+          <w:rFonts w:ascii="Times New Roman" w:hAnsi="Times New Roman" w:cs="Times New Roman"/>
+        </w:rPr>
+        <w:t xml:space="preserve"> not necessary for the exploit but can be used to achieve the exploit. </w:t>
+      </w:r>
+    </w:p>
+    <w:p>
+      <w:pPr>
+        <w:rPr>
+          <w:rFonts w:ascii="Times New Roman" w:hAnsi="Times New Roman" w:cs="Times New Roman"/>
+        </w:rPr>
+      </w:pPr>
+      <w:r>
+        <w:rPr>
+          <w:rFonts w:ascii="Times New Roman" w:hAnsi="Times New Roman" w:cs="Times New Roman"/>
+          <w:b/>
+          <w:bCs/>
+        </w:rPr>
+        <w:lastRenderedPageBreak/>
+        <w:t>My Experience</w:t>
+      </w:r>
+    </w:p>
+    <w:p>
+      <w:pPr>
+        <w:rPr>
+          <w:rFonts w:ascii="Times New Roman" w:hAnsi="Times New Roman" w:cs="Times New Roman"/>
+        </w:rPr>
+      </w:pPr>
+      <w:r>
+        <w:rPr>
+          <w:rFonts w:ascii="Times New Roman" w:hAnsi="Times New Roman" w:cs="Times New Roman"/>
+        </w:rPr>
+        <w:t xml:space="preserve">My experience was one of more frustration than pride. I spent many hours attempting to get the model qwen3.5:4b working with </w:t>
+      </w:r>
+      <w:proofErr w:type="spellStart"/>
+      <w:r>
+        <w:rPr>
+          <w:rFonts w:ascii="Times New Roman" w:hAnsi="Times New Roman" w:cs="Times New Roman"/>
+        </w:rPr>
+        <w:t>ollama</w:t>
+      </w:r>
+      <w:proofErr w:type="spellEnd"/>
+      <w:r>
+        <w:rPr>
+          <w:rFonts w:ascii="Times New Roman" w:hAnsi="Times New Roman" w:cs="Times New Roman"/>
+        </w:rPr>
+        <w:t xml:space="preserve"> through </w:t>
+      </w:r>
+      <w:proofErr w:type="spellStart"/>
+      <w:r>
+        <w:rPr>
+          <w:rFonts w:ascii="Times New Roman" w:hAnsi="Times New Roman" w:cs="Times New Roman"/>
+        </w:rPr>
+        <w:t>Openclaw</w:t>
+      </w:r>
+      <w:proofErr w:type="spellEnd"/>
+      <w:r>
+        <w:rPr>
+          <w:rFonts w:ascii="Times New Roman" w:hAnsi="Times New Roman" w:cs="Times New Roman"/>
+        </w:rPr>
+        <w:t>. I was experiencing massive slowdowns and times where my machine was completely overloaded by simply asking it to say hello. This made me quite frustrated and led me eventually to restart and make a new VM. For this second VM I decided to use the TAMU API key and things went much smoother. My machine did not experience slowdowns, and I was able to complete the remaining tasks. I was also frustrated when I got to the second trial of task 3 because I could not get the model to run the skill through indirect prompt injection.</w:t>
+      </w:r>
+      <w:r>
+        <w:rPr>
+          <w:rFonts w:ascii="Times New Roman" w:hAnsi="Times New Roman" w:cs="Times New Roman"/>
+        </w:rPr>
+        <w:t xml:space="preserve"> I decided to move on and just make it part of my report instead of try</w:t>
+      </w:r>
+      <w:r>
+        <w:rPr>
+          <w:rFonts w:ascii="Times New Roman" w:hAnsi="Times New Roman" w:cs="Times New Roman"/>
+        </w:rPr>
+        <w:t>ing</w:t>
+      </w:r>
+      <w:r>
+        <w:rPr>
+          <w:rFonts w:ascii="Times New Roman" w:hAnsi="Times New Roman" w:cs="Times New Roman"/>
+        </w:rPr>
+        <w:t xml:space="preserve"> </w:t>
+      </w:r>
+      <w:r>
+        <w:rPr>
+          <w:rFonts w:ascii="Times New Roman" w:hAnsi="Times New Roman" w:cs="Times New Roman"/>
+        </w:rPr>
+        <w:t>to</w:t>
+      </w:r>
+      <w:r>
+        <w:rPr>
+          <w:rFonts w:ascii="Times New Roman" w:hAnsi="Times New Roman" w:cs="Times New Roman"/>
+        </w:rPr>
+        <w:t xml:space="preserve"> force it in a more direct way</w:t>
+      </w:r>
+      <w:r>
+        <w:rPr>
+          <w:rFonts w:ascii="Times New Roman" w:hAnsi="Times New Roman" w:cs="Times New Roman"/>
+        </w:rPr>
+        <w:t xml:space="preserve">. I since came to realize this was most likely due to how I strictly I wrote my SKILL.md file. </w:t>
+      </w:r>
+      <w:r>
+        <w:rPr>
+          <w:rFonts w:ascii="Times New Roman" w:hAnsi="Times New Roman" w:cs="Times New Roman"/>
+        </w:rPr>
+        <w:t xml:space="preserve">All that to say, this assignment did not leave me with the feeling of having accomplished much. </w:t>
+      </w:r>
     </w:p>
     <w:sectPr>
-      <w:headerReference w:type="default" r:id="rId12"/>
+      <w:headerReference w:type="default" r:id="rId14"/>
       <w:pgSz w:w="12240" w:h="15840"/>
       <w:pgMar w:top="1440" w:right="1440" w:bottom="1440" w:left="1440" w:header="720" w:footer="720" w:gutter="0"/>
       <w:pgNumType w:start="1"/>

</xml_diff>